<commit_message>
update PRFAQ: focus on network troubleshooting agent + DevOps Agent integration
</commit_message>
<xml_diff>
--- a/operations-automation/ai-operations-assistant/PRFAQ_GenAIOperationsAssistant.docx
+++ b/operations-automation/ai-operations-assistant/PRFAQ_GenAIOperationsAssistant.docx
@@ -47,19 +47,11 @@
         </w:rPr>
         <w:t xml:space="preserve"> (</w:t>
       </w:r>
-      <w:proofErr w:type="spellStart"/>
       <w:r>
         <w:rPr>
           <w:i/>
         </w:rPr>
-        <w:t>cf</w:t>
-      </w:r>
-      <w:proofErr w:type="spellEnd"/>
-      <w:r>
-        <w:rPr>
-          <w:i/>
-        </w:rPr>
-        <w:t xml:space="preserve"> </w:t>
+        <w:t xml:space="preserve">cf </w:t>
       </w:r>
       <w:hyperlink r:id="rId11" w:history="1">
         <w:r>
@@ -128,7 +120,77 @@
     </w:p>
     <w:p>
       <w:r>
-        <w:t>AWS announced GenAI</w:t>
+        <w:t>AWS announced GenAI Operations Analytics Tool (G.O.A.T.), an open-source multi-agent AI platform that unifies and analyzes data from multiple AWS operational services through natural language. Designed as a Swiss Army knife for cloud operations, G.O.A.T. complements AWS DevOps Agent by covering capabilities it does not address—particularly deep network packet analysis, VPC Traffic Mirroring correlation, and cross-service operational data unification across Trusted Advisor, Health Dashboard, Support Cases, Cost tools, and network captures. While DevOps Agent excels at autonomous application-level incident investigation and remediation, G.O.A.T. focuses on infrastructure-layer analytics and extensibility: customers deploy it, use it daily, and forge their own "blades" for any data source or workflow they need. Both tools are compatible via MCP—the same MCP servers can serve G.O.A.T. and DevOps Agent simultaneously.</w:t>
+      </w:r>
+    </w:p>
+    <w:p>
+      <w:r>
+        <w:t>Today, operational teams face two challenges: fragmented visibility across AWS services, and uncertainty about how to apply GenAI to their work. A FinOps engineer checking Cost Optimization Hub may miss related Trusted Advisor recommendations. An SRE investigating an incident may not connect AWS Health events to recent support cases. Meanwhile, these same teams hear about GenAI capabilities but lack practical, operations-focused examples to learn from. TAMs observe these pain points regularly but need compelling demonstrations that show customers how GenAI solves real operational problems they can then use themselves.</w:t>
+      </w:r>
+    </w:p>
+    <w:p>
+      <w:r>
+        <w:t xml:space="preserve">GenAI </w:t>
+      </w:r>
+      <w:r>
+        <w:t xml:space="preserve">Operations </w:t>
+      </w:r>
+      <w:r>
+        <w:t xml:space="preserve">Analytics </w:t>
+      </w:r>
+      <w:r>
+        <w:t>Tool</w:t>
+      </w:r>
+      <w:r>
+        <w:t xml:space="preserve"> bridges both gaps. TAMs demonstrate the solution during customer calls, showing AI-powered analysis across six critical AWS data sources. Customers who see the value can immediately deploy the solution in their own environments—gaining hands-on GenAI experience while solving real operational challenges. The solution leverages Model Context Protocol (MCP) servers—including existing integrations for Billing and Cost Management, AWS API, CloudTrail, and Price List, plus new MCPs for Trusted Advisor and Health APIs—to enable natural language queries across operational data. Prepared prompt templates for Health event reporting, Trusted Advisor analysis, Support case insights, and cost optimization help customers get started quickly and learn effective GenAI interaction patterns.</w:t>
+      </w:r>
+    </w:p>
+    <w:p>
+      <w:r>
+        <w:t xml:space="preserve">"Operational teams want to leverage GenAI but don't know where to start—and they're drowning in data spread across multiple AWS consoles," said </w:t>
+      </w:r>
+      <w:r>
+        <w:t>Benjamin Lecoq</w:t>
+      </w:r>
+      <w:r>
+        <w:t xml:space="preserve">, </w:t>
+      </w:r>
+      <w:r>
+        <w:t xml:space="preserve">Principal </w:t>
+      </w:r>
+      <w:r>
+        <w:t>Cloud Operations Architect</w:t>
+      </w:r>
+      <w:r>
+        <w:t xml:space="preserve"> at AWS. "With GenAI </w:t>
+      </w:r>
+      <w:r>
+        <w:t xml:space="preserve">Operations </w:t>
+      </w:r>
+      <w:r>
+        <w:t xml:space="preserve">Analytics </w:t>
+      </w:r>
+      <w:r>
+        <w:t>Tool</w:t>
+      </w:r>
+      <w:r>
+        <w:t>, TAMs show customers what's possible in 25 minutes, then customers deploy it themselves. They learn GenAI by using it on real operational data</w:t>
+      </w:r>
+      <w:r>
+        <w:t xml:space="preserve"> with a library of pre-defined prompts</w:t>
+      </w:r>
+      <w:r>
+        <w:t>, and they get immediate value from unified analytics across Trusted Advisor, Health Dashboard, Support Cases, and Cost services."</w:t>
+      </w:r>
+    </w:p>
+    <w:p>
+      <w:r>
+        <w:t>TAMs introduce the demo during regular customer touchpoints—weekly business reviews, monthly operational reviews, or ad-hoc technical discussions. A typical demonstration takes 20-30 minutes including Q&amp;A. After seeing the demo, interested customers receive access to the public GitHub repository with complete code, MCP server implementations, deployment guides, and documentation. Customers deploy the solution in their own AWS accounts and begin using it for daily operations—querying Trusted Advisor recommendations, correlating Health events with support cases, analyzing cost optimization opportunities, and building organizational knowledge. The hands-on experience accelerates their GenAI learning while delivering immediate operational value.</w:t>
+      </w:r>
+    </w:p>
+    <w:p>
+      <w:r>
+        <w:t>"Our TAM showed us the GenAI</w:t>
       </w:r>
       <w:r>
         <w:t xml:space="preserve"> Operations</w:t>
@@ -137,397 +199,271 @@
         <w:t xml:space="preserve"> Analytics </w:t>
       </w:r>
       <w:r>
-        <w:t>Tool (</w:t>
-      </w:r>
-      <w:r>
-        <w:rPr>
-          <w:b/>
-          <w:bCs/>
-        </w:rPr>
-        <w:t>G.O.A.T.</w:t>
-      </w:r>
-      <w:r>
-        <w:t>)</w:t>
-      </w:r>
-      <w:r>
-        <w:t>, a demonstration solution that Technical Account Managers (TAMs) showcase to customers, enabling them to deploy and use generative AI for unifying and analyzing data from multiple AWS operational services—including Trusted Advisor, AWS Health Dashboard, Support Case Console, Cost Optimization Hub, Cost Explorer</w:t>
-      </w:r>
-      <w:r>
-        <w:t xml:space="preserve">, End of Life </w:t>
-      </w:r>
-      <w:r>
-        <w:t>Tracker information</w:t>
-      </w:r>
-      <w:r>
-        <w:t xml:space="preserve">, and Cost and Usage Reports. The solution serves dual purposes: helping customers build practical GenAI knowledge through hands-on </w:t>
-      </w:r>
-      <w:r>
-        <w:t>experience and</w:t>
-      </w:r>
-      <w:r>
-        <w:t xml:space="preserve"> providing immediate operational value for daily cloud management tasks.</w:t>
-      </w:r>
-    </w:p>
-    <w:p>
-      <w:r>
-        <w:t>Today, operational teams face two challenges: fragmented visibility across AWS services, and uncertainty about how to apply GenAI to their work. A FinOps engineer checking Cost Optimization Hub may miss related Trusted Advisor recommendations. An SRE investigating an incident may not connect AWS Health events to recent support cases. Meanwhile, these same teams hear about GenAI capabilities but lack practical, operations-focused examples to learn from. TAMs observe these pain points regularly but need compelling demonstrations that show customers how GenAI solves real operational problems they can then use themselves.</w:t>
-      </w:r>
-    </w:p>
-    <w:p>
-      <w:r>
+        <w:t>Tool</w:t>
+      </w:r>
+      <w:r>
+        <w:t xml:space="preserve"> in our monthly review—it correlated a Trusted Advisor security finding with an open support case and a recent Health event in seconds," said </w:t>
+      </w:r>
+      <w:r>
+        <w:t>Fictional Customer</w:t>
+      </w:r>
+      <w:r>
+        <w:t xml:space="preserve"> at </w:t>
+      </w:r>
+      <w:r>
+        <w:t>Fictional Company</w:t>
+      </w:r>
+      <w:r>
+        <w:t xml:space="preserve">. "We deployed it that week. Now our operations team uses it daily for incident </w:t>
+      </w:r>
+      <w:r>
+        <w:lastRenderedPageBreak/>
+        <w:t>investigation and weekly reporting. More importantly, it's become our GenAI learning platform—our engineers are building confidence with AI by using it on familiar operational data. We've already started extending it with custom prompt templates for our specific workflows."</w:t>
+      </w:r>
+    </w:p>
+    <w:p>
+      <w:r>
+        <w:t>To see a demo during your next TAM call, simply ask your AWS Technical Account Manager. To explore the solution and deploy it yourself, visit [URL] to access the repository and documentation.</w:t>
+      </w:r>
+    </w:p>
+    <w:p>
+      <w:pPr>
+        <w:pStyle w:val="Heading2"/>
+      </w:pPr>
+      <w:r>
+        <w:t>Standout Capability: Network Troubleshooting Agent</w:t>
+      </w:r>
+    </w:p>
+    <w:p>
+      <w:r>
+        <w:t>The Network Troubleshooting Agent is the standout blade of the G.O.A.T. Swiss Army knife. It captures VPC traffic via Traffic Mirroring, analyzes packets with AI, and correlates network anomalies with Health events, Support cases, and Trusted Advisor findings. When a fragmented TLS Client Hello silently breaks Network Firewall Suricata rules, this agent surfaces the root cause in seconds instead of days of manual console-hopping.</w:t>
+      </w:r>
+    </w:p>
+    <w:p>
+      <w:r>
+        <w:t>This capability addresses a gap that AWS DevOps Agent does not cover. DevOps Agent focuses on autonomous incident investigation, root cause analysis, and remediation within the application stack. It excels at correlating alarms, analyzing code deployments, and providing mitigation plans for application-level incidents. However, it does not perform deep network packet analysis, VPC Traffic Mirroring correlation, or cross-service operational data unification across Health, Support, Trusted Advisor, and Cost tools. G.O.A.T.'s Network Agent fills this gap by providing AI-powered network forensics at the infrastructure layer.</w:t>
+      </w:r>
+    </w:p>
+    <w:p>
+      <w:r>
+        <w:t>Critically, the Network Agent is designed to be compatible with AWS DevOps Agent via MCP. The same MCP tools can serve both G.O.A.T.'s orchestrator and DevOps Agent simultaneously. This means customers can leverage G.O.A.T.'s network troubleshooting capabilities as an extension of their DevOps Agent setup, creating a unified operations experience that spans both application-level incident response and infrastructure-level network forensics.</w:t>
+      </w:r>
+    </w:p>
+    <w:p>
+      <w:r>
+        <w:t>Example use cases for the Network Troubleshooting Agent:</w:t>
+      </w:r>
+    </w:p>
+    <w:p>
+      <w:r>
+        <w:t>TLS/MTU Analysis: Detect fragmented Client Hello packets caused by post-quantum cryptography (ML-KEM) upgrades that exceed Network Firewall inspection capacity, silently dropping traffic to ECR, Organizations, or Step Functions</w:t>
+      </w:r>
+    </w:p>
+    <w:p>
+      <w:r>
+        <w:t>VPC Flow Correlation: Correlate VPC Flow Logs with Health events and recent deployments to identify network path issues across complex multi-account Landing Zones</w:t>
+      </w:r>
+    </w:p>
+    <w:p>
+      <w:r>
+        <w:t>Security Group Forensics: Analyze rejected traffic patterns across security groups and NACLs, correlating with Trusted Advisor security findings</w:t>
+      </w:r>
+    </w:p>
+    <w:p>
+      <w:r>
+        <w:t>DNS Resolution Troubleshooting: Investigate Route 53 Resolver query patterns and VPC endpoint connectivity issues using natural language queries</w:t>
+      </w:r>
+    </w:p>
+    <w:p>
+      <w:r>
+        <w:t>Cross-Account Network Path Analysis: Trace connectivity issues across Transit Gateway, VPC Peering, and PrivateLink connections in multi-account environments</w:t>
+      </w:r>
+    </w:p>
+    <w:p/>
+    <w:p>
+      <w:pPr>
+        <w:pStyle w:val="Heading1"/>
+      </w:pPr>
+      <w:r>
+        <w:t>Frequently Asked Questions (FAQs)</w:t>
+      </w:r>
+    </w:p>
+    <w:p>
+      <w:pPr>
+        <w:pStyle w:val="Heading2"/>
+      </w:pPr>
+      <w:r>
+        <w:t>Customer FAQs</w:t>
+      </w:r>
+    </w:p>
+    <w:p>
+      <w:pPr>
+        <w:pStyle w:val="ListParagraph"/>
+      </w:pPr>
+      <w:r>
+        <w:t>What AWS data sources does the GenAI</w:t>
+      </w:r>
+      <w:r>
+        <w:t xml:space="preserve"> Operations</w:t>
+      </w:r>
+      <w:r>
+        <w:t xml:space="preserve"> Analytics </w:t>
+      </w:r>
+      <w:r>
+        <w:t>Tool</w:t>
+      </w:r>
+      <w:r>
+        <w:t xml:space="preserve"> integrate?</w:t>
+      </w:r>
+    </w:p>
+    <w:p>
+      <w:r>
+        <w:t xml:space="preserve">The solution integrates </w:t>
+      </w:r>
+      <w:r>
+        <w:t>several</w:t>
+      </w:r>
+      <w:r>
+        <w:t xml:space="preserve"> critical AWS operational data sources through MCP servers:</w:t>
+      </w:r>
+    </w:p>
+    <w:p>
+      <w:pPr>
+        <w:pStyle w:val="ListBullet"/>
+      </w:pPr>
+      <w:r>
+        <w:lastRenderedPageBreak/>
+        <w:t xml:space="preserve">AWS Trusted Advisor: Access to 465+ best practice checks across five </w:t>
+      </w:r>
+      <w:r>
+        <w:t xml:space="preserve">pillars: </w:t>
+      </w:r>
+      <w:r>
+        <w:t>cost optimization, security, performance, fault tolerance, and service quotas. Query recommendations by category, severity, or affected resources.</w:t>
+      </w:r>
+    </w:p>
+    <w:p>
+      <w:pPr>
+        <w:pStyle w:val="ListBullet"/>
+      </w:pPr>
+      <w:r>
+        <w:t>AWS Health Dashboard: Account-specific events, organization-wide events, scheduled changes, and notifications. Correlate health events with other operational data for root cause analysis.</w:t>
+      </w:r>
+    </w:p>
+    <w:p>
+      <w:pPr>
+        <w:pStyle w:val="ListBullet"/>
+      </w:pPr>
+      <w:r>
+        <w:t>AWS Support Case Console: Case management data including communications history, attachments, resolution details, and case metadata. Build institutional knowledge from past incidents.</w:t>
+      </w:r>
+    </w:p>
+    <w:p>
+      <w:pPr>
+        <w:pStyle w:val="ListBullet"/>
+      </w:pPr>
+      <w:r>
+        <w:t>Cost Optimization Hub: 16+ recommendation types that consolidate insights from Cost Explorer, Compute Optimizer, and other services. Unified view of savings opportunities across the organization.</w:t>
+      </w:r>
+    </w:p>
+    <w:p>
+      <w:pPr>
+        <w:pStyle w:val="ListBullet"/>
+      </w:pPr>
+      <w:r>
+        <w:t>AWS Cost Explorer: 13 months of historical cost data and 18 months of forecasting capability. Analyze spending trends, anomalies, and budget performance.</w:t>
+      </w:r>
+    </w:p>
+    <w:p>
+      <w:pPr>
+        <w:pStyle w:val="ListBullet"/>
+      </w:pPr>
+      <w:r>
+        <w:t>Cost and Usage Reports (CUR): Comprehensive, granular cost and usage data for detailed analysis and custom reporting.</w:t>
+      </w:r>
+    </w:p>
+    <w:p>
+      <w:pPr>
+        <w:pStyle w:val="ListBullet"/>
+      </w:pPr>
+      <w:r>
+        <w:t>VPC Network Captures: On-demand packet capture via Traffic Mirroring with AI-powered analysis. Deep TCP/TLS inspection including fragmentation detection, retransmission analysis, handshake reconstruction, and correlation with other operational data sources for end-to-end network troubleshooting.</w:t>
+      </w:r>
+    </w:p>
+    <w:p>
+      <w:pPr>
+        <w:pStyle w:val="ListBullet"/>
+      </w:pPr>
+      <w:r>
+        <w:t>W</w:t>
+      </w:r>
+      <w:r>
+        <w:t>e can also include EOL Tracker project to this solution</w:t>
+      </w:r>
+    </w:p>
+    <w:p>
+      <w:r>
+        <w:t xml:space="preserve">We will provide a platform with common core functionalities, and multiple tools that can be deployed </w:t>
+      </w:r>
+      <w:r>
+        <w:t xml:space="preserve">optionally in order to provide flexibility for the customer (they can pick </w:t>
+      </w:r>
+      <w:r>
+        <w:t>which capability the want to deploy for Cost Optim purpose or other reasons.</w:t>
+      </w:r>
+      <w:r>
+        <w:t xml:space="preserve"> </w:t>
+      </w:r>
+    </w:p>
+    <w:p>
+      <w:r>
+        <w:t>The TAM demonstrates these capabilities; the customer then deploys and use them in their environment for daily operations.</w:t>
+      </w:r>
+    </w:p>
+    <w:p>
+      <w:pPr>
+        <w:pStyle w:val="ListParagraph"/>
+      </w:pPr>
+      <w:r>
+        <w:t>How does this help us learn GenAI?</w:t>
+      </w:r>
+    </w:p>
+    <w:p>
+      <w:pPr>
+        <w:ind w:left="170"/>
+        <w:rPr>
+          <w:lang w:eastAsia="fr-FR"/>
+        </w:rPr>
+      </w:pPr>
+      <w:r>
+        <w:rPr>
+          <w:lang w:eastAsia="fr-FR"/>
+        </w:rPr>
         <w:t xml:space="preserve">GenAI </w:t>
       </w:r>
       <w:r>
+        <w:rPr>
+          <w:lang w:eastAsia="fr-FR"/>
+        </w:rPr>
         <w:t xml:space="preserve">Operations </w:t>
       </w:r>
       <w:r>
+        <w:rPr>
+          <w:lang w:eastAsia="fr-FR"/>
+        </w:rPr>
         <w:t xml:space="preserve">Analytics </w:t>
       </w:r>
       <w:r>
+        <w:rPr>
+          <w:lang w:eastAsia="fr-FR"/>
+        </w:rPr>
         <w:t>Tool</w:t>
       </w:r>
       <w:r>
-        <w:t xml:space="preserve"> bridges both gaps. TAMs demonstrate the solution during customer calls, showing AI-powered analysis across six critical AWS data sources. Customers who see the value can immediately deploy the solution in their own environments—gaining hands-on GenAI experience while solving real operational challenges. The solution leverages Model Context Protocol (MCP) servers—including existing integrations for Billing and Cost Management, AWS API, CloudTrail, and Price List, plus new MCPs for Trusted Advisor and Health APIs—to enable natural language queries across operational data. Prepared prompt templates for Health event reporting, Trusted Advisor analysis, Support case insights, and cost optimization help customers get started quickly and learn effective GenAI interaction patterns.</w:t>
-      </w:r>
-    </w:p>
-    <w:p>
-      <w:r>
-        <w:t>It is possible to use the output</w:t>
-      </w:r>
-      <w:r>
-        <w:t xml:space="preserve"> of the chatbot</w:t>
-      </w:r>
-      <w:r>
-        <w:t xml:space="preserve"> </w:t>
-      </w:r>
-      <w:r>
-        <w:t xml:space="preserve">in </w:t>
-      </w:r>
-      <w:proofErr w:type="spellStart"/>
-      <w:r>
-        <w:t>QuickSuite</w:t>
-      </w:r>
-      <w:proofErr w:type="spellEnd"/>
-      <w:r>
-        <w:t xml:space="preserve"> for data visualization.</w:t>
-      </w:r>
-    </w:p>
-    <w:p>
-      <w:r>
-        <w:t xml:space="preserve">"Operational teams want to leverage GenAI but don't know where to start—and they're drowning in data spread across multiple AWS consoles," said </w:t>
-      </w:r>
-      <w:r>
-        <w:t>Benjamin Lecoq</w:t>
-      </w:r>
-      <w:r>
-        <w:t xml:space="preserve">, </w:t>
-      </w:r>
-      <w:r>
-        <w:t xml:space="preserve">Principal </w:t>
-      </w:r>
-      <w:r>
-        <w:t>Cloud Operations Architect</w:t>
-      </w:r>
-      <w:r>
-        <w:t xml:space="preserve"> at AWS. "With GenAI </w:t>
-      </w:r>
-      <w:r>
-        <w:t xml:space="preserve">Operations </w:t>
-      </w:r>
-      <w:r>
-        <w:t xml:space="preserve">Analytics </w:t>
-      </w:r>
-      <w:r>
-        <w:t>Tool</w:t>
-      </w:r>
-      <w:r>
-        <w:t>, TAMs show customers what's possible in 25 minutes, then customers deploy it themselves. They learn GenAI by using it on real operational data</w:t>
-      </w:r>
-      <w:r>
-        <w:t xml:space="preserve"> with a library of pre-defined prompts</w:t>
-      </w:r>
-      <w:r>
-        <w:t>, and they get immediate value from unified analytics across Trusted Advisor, Health Dashboard, Support Cases, and Cost services."</w:t>
-      </w:r>
-    </w:p>
-    <w:p>
-      <w:r>
-        <w:t>TAMs introduce the demo during regular customer touchpoints—weekly business reviews, monthly operational reviews, or ad-hoc technical discussions. A typical demonstration takes 20-30 minutes including Q&amp;A. After seeing the demo, interested customers receive access to the public GitHub repository with complete code, MCP server implementations, deployment guides, and documentation. Customers deploy the solution in their own AWS accounts and begin using it for daily operations—querying Trusted Advisor recommendations, correlating Health events with support cases, analyzing cost optimization opportunities, and building organizational knowledge. The hands-on experience accelerates their GenAI learning while delivering immediate operational value.</w:t>
-      </w:r>
-    </w:p>
-    <w:p>
-      <w:r>
-        <w:t>"Our TAM showed us the GenAI</w:t>
-      </w:r>
-      <w:r>
-        <w:t xml:space="preserve"> Operations</w:t>
-      </w:r>
-      <w:r>
-        <w:t xml:space="preserve"> Analytics </w:t>
-      </w:r>
-      <w:r>
-        <w:t>Tool</w:t>
-      </w:r>
-      <w:r>
-        <w:t xml:space="preserve"> in our monthly review—it correlated a Trusted Advisor security finding with an open support case and a recent Health event in seconds," said </w:t>
-      </w:r>
-      <w:r>
-        <w:t>Fictional Customer</w:t>
-      </w:r>
-      <w:r>
-        <w:t xml:space="preserve"> at </w:t>
-      </w:r>
-      <w:r>
-        <w:t>Fictional Company</w:t>
-      </w:r>
-      <w:r>
-        <w:t>. "We deployed it that week. Now our operations team uses it daily for incident investigation and weekly reporting. More importantly, it's become our GenAI learning platform—our engineers are building confidence with AI by using it on familiar operational data. We've already started extending it with custom prompt templates for our specific workflows."</w:t>
-      </w:r>
-    </w:p>
-    <w:p>
-      <w:r>
-        <w:t>To see a demo during your next TAM call, simply ask your AWS Technical Account Manager. To explore the solution and deploy it yourself, visit [URL] to access the repository and documentation.</w:t>
-      </w:r>
-    </w:p>
-    <w:p>
-      <w:pPr>
-        <w:rPr>
-          <w:u w:val="single"/>
-        </w:rPr>
-      </w:pPr>
-      <w:r>
-        <w:rPr>
-          <w:u w:val="single"/>
-        </w:rPr>
-        <w:t>Note:</w:t>
-      </w:r>
-    </w:p>
-    <w:p>
-      <w:r>
-        <w:t xml:space="preserve">Amazon Q </w:t>
-      </w:r>
-      <w:r>
-        <w:t xml:space="preserve">in the AWS console </w:t>
-      </w:r>
-      <w:r>
-        <w:t xml:space="preserve">or Q CLI with </w:t>
-      </w:r>
-      <w:r>
-        <w:t>MCP servers configured are</w:t>
-      </w:r>
-      <w:r>
-        <w:t xml:space="preserve"> already providing some of the listed capabilities, but</w:t>
-      </w:r>
-      <w:r>
-        <w:t xml:space="preserve"> ha</w:t>
-      </w:r>
-      <w:r>
-        <w:t>ve</w:t>
-      </w:r>
-      <w:r>
-        <w:t xml:space="preserve"> limitations</w:t>
-      </w:r>
-      <w:r>
-        <w:t>:</w:t>
-      </w:r>
-    </w:p>
-    <w:p>
-      <w:pPr>
-        <w:pStyle w:val="ListParagraph"/>
-        <w:numPr>
-          <w:ilvl w:val="0"/>
-          <w:numId w:val="18"/>
-        </w:numPr>
-        <w:rPr>
-          <w:u w:val="none"/>
-        </w:rPr>
-      </w:pPr>
-      <w:r>
-        <w:rPr>
-          <w:u w:val="none"/>
-        </w:rPr>
-        <w:t xml:space="preserve">The capabilities are not integrated and cannot </w:t>
-      </w:r>
-      <w:r>
-        <w:rPr>
-          <w:u w:val="none"/>
-        </w:rPr>
-        <w:t xml:space="preserve">correlate </w:t>
-      </w:r>
-      <w:r>
-        <w:rPr>
-          <w:u w:val="none"/>
-        </w:rPr>
-        <w:t>information from different sources</w:t>
-      </w:r>
-      <w:r>
-        <w:rPr>
-          <w:u w:val="none"/>
-        </w:rPr>
-        <w:t xml:space="preserve">, especially when the </w:t>
-      </w:r>
-      <w:r>
-        <w:rPr>
-          <w:u w:val="none"/>
-        </w:rPr>
-        <w:t xml:space="preserve">data are not provided </w:t>
-      </w:r>
-      <w:r>
-        <w:rPr>
-          <w:u w:val="none"/>
-        </w:rPr>
-        <w:t xml:space="preserve">natively </w:t>
-      </w:r>
-      <w:r>
-        <w:rPr>
-          <w:u w:val="none"/>
-        </w:rPr>
-        <w:t xml:space="preserve">at Org level and need to be consolidated </w:t>
-      </w:r>
-      <w:r>
-        <w:rPr>
-          <w:u w:val="none"/>
-        </w:rPr>
-        <w:t>account by account</w:t>
-      </w:r>
-    </w:p>
-    <w:p>
-      <w:pPr>
-        <w:pStyle w:val="ListParagraph"/>
-        <w:numPr>
-          <w:ilvl w:val="0"/>
-          <w:numId w:val="18"/>
-        </w:numPr>
-        <w:rPr>
-          <w:u w:val="none"/>
-        </w:rPr>
-      </w:pPr>
-      <w:r>
-        <w:rPr>
-          <w:u w:val="none"/>
-        </w:rPr>
-        <w:t xml:space="preserve">Amazon Q </w:t>
-      </w:r>
-      <w:r>
-        <w:rPr>
-          <w:u w:val="none"/>
-        </w:rPr>
-        <w:t>is well i</w:t>
-      </w:r>
-      <w:r>
-        <w:rPr>
-          <w:u w:val="none"/>
-        </w:rPr>
-        <w:t>ntegra</w:t>
-      </w:r>
-      <w:r>
-        <w:rPr>
-          <w:u w:val="none"/>
-        </w:rPr>
-        <w:t>ted with Cost Optimization Hub, Cost Explorer, Health Dashboard, but cannot retrieve</w:t>
-      </w:r>
-      <w:r>
-        <w:rPr>
-          <w:u w:val="none"/>
-        </w:rPr>
-        <w:t xml:space="preserve"> case</w:t>
-      </w:r>
-      <w:r>
-        <w:rPr>
-          <w:u w:val="none"/>
-        </w:rPr>
-        <w:t xml:space="preserve"> </w:t>
-      </w:r>
-      <w:r>
-        <w:rPr>
-          <w:u w:val="none"/>
-        </w:rPr>
-        <w:t xml:space="preserve">communications </w:t>
-      </w:r>
-      <w:r>
-        <w:rPr>
-          <w:u w:val="none"/>
-        </w:rPr>
-        <w:t>from</w:t>
-      </w:r>
-      <w:r>
-        <w:rPr>
-          <w:u w:val="none"/>
-        </w:rPr>
-        <w:t xml:space="preserve"> the support</w:t>
-      </w:r>
-      <w:r>
-        <w:rPr>
-          <w:u w:val="none"/>
-        </w:rPr>
-        <w:t xml:space="preserve"> cases</w:t>
-      </w:r>
-      <w:r>
-        <w:rPr>
-          <w:u w:val="none"/>
-        </w:rPr>
-        <w:t>, and cannot query Trusted Advisor</w:t>
-      </w:r>
-      <w:r>
-        <w:rPr>
-          <w:u w:val="none"/>
-        </w:rPr>
-        <w:t xml:space="preserve"> recommendations</w:t>
-      </w:r>
-    </w:p>
-    <w:p>
-      <w:pPr>
-        <w:pStyle w:val="Heading1"/>
-      </w:pPr>
-      <w:r>
-        <w:t>Frequently Asked Questions (FAQs)</w:t>
-      </w:r>
-    </w:p>
-    <w:p>
-      <w:pPr>
-        <w:pStyle w:val="Heading2"/>
-      </w:pPr>
-      <w:r>
-        <w:t>Customer FAQs</w:t>
-      </w:r>
-    </w:p>
-    <w:p>
-      <w:pPr>
-        <w:pStyle w:val="ListParagraph"/>
-      </w:pPr>
-      <w:r>
-        <w:t xml:space="preserve">What AWS data sources </w:t>
-      </w:r>
-      <w:proofErr w:type="gramStart"/>
-      <w:r>
-        <w:t>does</w:t>
-      </w:r>
-      <w:proofErr w:type="gramEnd"/>
-      <w:r>
-        <w:t xml:space="preserve"> the GenAI</w:t>
-      </w:r>
-      <w:r>
-        <w:t xml:space="preserve"> Operations</w:t>
-      </w:r>
-      <w:r>
-        <w:t xml:space="preserve"> Analytics </w:t>
-      </w:r>
-      <w:r>
-        <w:t>Tool</w:t>
-      </w:r>
-      <w:r>
-        <w:t xml:space="preserve"> integrate?</w:t>
-      </w:r>
-    </w:p>
-    <w:p>
-      <w:r>
-        <w:t xml:space="preserve">The solution integrates </w:t>
-      </w:r>
-      <w:r>
-        <w:t>several</w:t>
-      </w:r>
-      <w:r>
-        <w:t xml:space="preserve"> critical AWS operational data sources through MCP servers:</w:t>
+        <w:rPr>
+          <w:lang w:eastAsia="fr-FR"/>
+        </w:rPr>
+        <w:t xml:space="preserve"> serves as a practical GenAI learning platform for operations teams:</w:t>
       </w:r>
     </w:p>
     <w:p>
@@ -535,13 +471,7 @@
         <w:pStyle w:val="ListBullet"/>
       </w:pPr>
       <w:r>
-        <w:t xml:space="preserve">AWS Trusted Advisor: Access to 465+ best practice checks across five </w:t>
-      </w:r>
-      <w:r>
-        <w:t xml:space="preserve">pillars: </w:t>
-      </w:r>
-      <w:r>
-        <w:t>cost optimization, security, performance, fault tolerance, and service quotas. Query recommendations by category, severity, or affected resources.</w:t>
+        <w:t>Familiar Context: You're querying data you already understand (Trusted Advisor, costs, support cases), so you can focus on learning GenAI interaction patterns rather than unfamiliar domains</w:t>
       </w:r>
     </w:p>
     <w:p>
@@ -549,7 +479,7 @@
         <w:pStyle w:val="ListBullet"/>
       </w:pPr>
       <w:r>
-        <w:t>AWS Health Dashboard: Account-specific events, organization-wide events, scheduled changes, and notifications. Correlate health events with other operational data for root cause analysis.</w:t>
+        <w:t>Immediate Feedback: See how natural language queries translate to actionable insights on your real operational data</w:t>
       </w:r>
     </w:p>
     <w:p>
@@ -557,7 +487,7 @@
         <w:pStyle w:val="ListBullet"/>
       </w:pPr>
       <w:r>
-        <w:t>AWS Support Case Console: Case management data including communications history, attachments, resolution details, and case metadata. Build institutional knowledge from past incidents.</w:t>
+        <w:t>Prompt Engineering Practice: The prepared templates show effective prompt patterns; you learn by using them and creating your own</w:t>
       </w:r>
     </w:p>
     <w:p>
@@ -565,7 +495,7 @@
         <w:pStyle w:val="ListBullet"/>
       </w:pPr>
       <w:r>
-        <w:t>Cost Optimization Hub: 16+ recommendation types that consolidate insights from Cost Explorer, Compute Optimizer, and other services. Unified view of savings opportunities across the organization.</w:t>
+        <w:t>Low-Risk Environment: Read-only queries on operational data—you can experiment freely without risk to production systems</w:t>
       </w:r>
     </w:p>
     <w:p>
@@ -573,7 +503,7 @@
         <w:pStyle w:val="ListBullet"/>
       </w:pPr>
       <w:r>
-        <w:t>AWS Cost Explorer: 13 months of historical cost data and 18 months of forecasting capability. Analyze spending trends, anomalies, and budget performance.</w:t>
+        <w:t>Progressive Complexity: Start with simple queries ("List critical Trusted Advisor findings"), advance to complex correlations ("Connect this cost spike to Health events and configuration changes")</w:t>
       </w:r>
     </w:p>
     <w:p>
@@ -581,194 +511,13 @@
         <w:pStyle w:val="ListBullet"/>
       </w:pPr>
       <w:r>
-        <w:t>Cost and Usage Reports (CUR): Comprehensive, granular cost and usage data for detailed analysis and custom reporting.</w:t>
-      </w:r>
-    </w:p>
-    <w:p>
-      <w:pPr>
-        <w:pStyle w:val="ListBullet"/>
-      </w:pPr>
-      <w:r>
-        <w:t>W</w:t>
-      </w:r>
-      <w:r>
-        <w:t xml:space="preserve">e can also include EOL Tracker project </w:t>
-      </w:r>
-      <w:proofErr w:type="gramStart"/>
-      <w:r>
-        <w:t>to</w:t>
-      </w:r>
-      <w:proofErr w:type="gramEnd"/>
-      <w:r>
-        <w:t xml:space="preserve"> this solution</w:t>
-      </w:r>
-    </w:p>
-    <w:p>
-      <w:r>
-        <w:t xml:space="preserve">We will provide a platform with common core functionalities, and multiple tools that can be deployed </w:t>
-      </w:r>
-      <w:r>
-        <w:t xml:space="preserve">optionally </w:t>
-      </w:r>
-      <w:proofErr w:type="gramStart"/>
-      <w:r>
-        <w:t>in order to</w:t>
-      </w:r>
-      <w:proofErr w:type="gramEnd"/>
-      <w:r>
-        <w:t xml:space="preserve"> provide flexibility for the customer (they can pick </w:t>
-      </w:r>
-      <w:r>
-        <w:t xml:space="preserve">which capability </w:t>
-      </w:r>
-      <w:proofErr w:type="spellStart"/>
-      <w:proofErr w:type="gramStart"/>
-      <w:r>
-        <w:t>the</w:t>
-      </w:r>
-      <w:proofErr w:type="spellEnd"/>
-      <w:proofErr w:type="gramEnd"/>
-      <w:r>
-        <w:t xml:space="preserve"> want to deploy for Cost </w:t>
-      </w:r>
-      <w:proofErr w:type="spellStart"/>
-      <w:r>
-        <w:t>Optim</w:t>
-      </w:r>
-      <w:proofErr w:type="spellEnd"/>
-      <w:r>
-        <w:t xml:space="preserve"> purpose or other reasons.</w:t>
-      </w:r>
-      <w:r>
-        <w:t xml:space="preserve"> </w:t>
-      </w:r>
-    </w:p>
-    <w:p>
-      <w:r>
-        <w:t xml:space="preserve">The TAM demonstrates these capabilities; the customer then </w:t>
-      </w:r>
-      <w:proofErr w:type="gramStart"/>
-      <w:r>
-        <w:t>deploys</w:t>
-      </w:r>
-      <w:proofErr w:type="gramEnd"/>
-      <w:r>
-        <w:t xml:space="preserve"> and use them in their environment for daily operations.</w:t>
-      </w:r>
-    </w:p>
-    <w:p>
-      <w:pPr>
-        <w:pStyle w:val="ListParagraph"/>
-      </w:pPr>
-      <w:r>
-        <w:t>How does this help us learn GenAI?</w:t>
-      </w:r>
-    </w:p>
-    <w:p>
-      <w:pPr>
-        <w:ind w:left="170"/>
-        <w:rPr>
-          <w:lang w:eastAsia="fr-FR"/>
-        </w:rPr>
-      </w:pPr>
-      <w:r>
-        <w:rPr>
-          <w:lang w:eastAsia="fr-FR"/>
-        </w:rPr>
-        <w:t xml:space="preserve">GenAI </w:t>
-      </w:r>
-      <w:r>
-        <w:rPr>
-          <w:lang w:eastAsia="fr-FR"/>
-        </w:rPr>
-        <w:t xml:space="preserve">Operations </w:t>
-      </w:r>
-      <w:r>
-        <w:rPr>
-          <w:lang w:eastAsia="fr-FR"/>
-        </w:rPr>
-        <w:t xml:space="preserve">Analytics </w:t>
-      </w:r>
-      <w:r>
-        <w:rPr>
-          <w:lang w:eastAsia="fr-FR"/>
-        </w:rPr>
-        <w:t>Tool</w:t>
-      </w:r>
-      <w:r>
-        <w:rPr>
-          <w:lang w:eastAsia="fr-FR"/>
-        </w:rPr>
-        <w:t xml:space="preserve"> serves as a practical GenAI learning platform for operations teams:</w:t>
-      </w:r>
-    </w:p>
-    <w:p>
-      <w:pPr>
-        <w:pStyle w:val="ListBullet"/>
-      </w:pPr>
-      <w:r>
-        <w:t>Familiar Context: You're querying data you already understand (Trusted Advisor, costs, support cases), so you can focus on learning GenAI interaction patterns rather than unfamiliar domains</w:t>
-      </w:r>
-    </w:p>
-    <w:p>
-      <w:pPr>
-        <w:pStyle w:val="ListBullet"/>
-      </w:pPr>
-      <w:r>
-        <w:t>Immediate Feedback: See how natural language queries translate to actionable insights on your real operational data</w:t>
-      </w:r>
-    </w:p>
-    <w:p>
-      <w:pPr>
-        <w:pStyle w:val="ListBullet"/>
-      </w:pPr>
-      <w:r>
-        <w:t>Prompt Engineering Practice: The prepared templates show effective prompt patterns; you learn by using them and creating your own</w:t>
-      </w:r>
-    </w:p>
-    <w:p>
-      <w:pPr>
-        <w:pStyle w:val="ListBullet"/>
-      </w:pPr>
-      <w:r>
-        <w:t>Low-Risk Environment: Read-only queries on operational data—you can experiment freely without risk to production systems</w:t>
-      </w:r>
-    </w:p>
-    <w:p>
-      <w:pPr>
-        <w:pStyle w:val="ListBullet"/>
-      </w:pPr>
-      <w:r>
-        <w:t>Progressive Complexity: Start with simple queries ("List critical Trusted Advisor findings"), advance to complex correlations ("Connect this cost spike to Health events and configuration changes")</w:t>
-      </w:r>
-    </w:p>
-    <w:p>
-      <w:pPr>
-        <w:pStyle w:val="ListBullet"/>
-      </w:pPr>
-      <w:r>
         <w:t xml:space="preserve">Easy to </w:t>
       </w:r>
       <w:r>
         <w:t xml:space="preserve">modify: It’s very simple to customize or modify the </w:t>
       </w:r>
-      <w:proofErr w:type="gramStart"/>
-      <w:r>
-        <w:t>open source</w:t>
-      </w:r>
-      <w:proofErr w:type="gramEnd"/>
-      <w:r>
-        <w:t xml:space="preserve"> code to answer </w:t>
-      </w:r>
-      <w:proofErr w:type="spellStart"/>
-      <w:proofErr w:type="gramStart"/>
-      <w:r>
-        <w:t>customers</w:t>
-      </w:r>
-      <w:proofErr w:type="spellEnd"/>
-      <w:proofErr w:type="gramEnd"/>
-      <w:r>
-        <w:t xml:space="preserve"> needs.</w:t>
+      <w:r>
+        <w:t>open source code to answer customers needs.</w:t>
       </w:r>
     </w:p>
     <w:p>
@@ -781,15 +530,7 @@
         <w:ind w:left="360" w:hanging="360"/>
       </w:pPr>
       <w:r>
-        <w:t xml:space="preserve">It is also possible to use </w:t>
-      </w:r>
-      <w:proofErr w:type="spellStart"/>
-      <w:r>
-        <w:t>QuickSuite</w:t>
-      </w:r>
-      <w:proofErr w:type="spellEnd"/>
-      <w:r>
-        <w:t xml:space="preserve"> capabilities to generate graphs and diagrams </w:t>
+        <w:t xml:space="preserve">It is also possible to use QuickSuite capabilities to generate graphs and diagrams </w:t>
       </w:r>
       <w:r>
         <w:t>for visual</w:t>
@@ -832,6 +573,7 @@
         <w:ind w:left="360" w:hanging="360"/>
       </w:pPr>
       <w:r>
+        <w:lastRenderedPageBreak/>
         <w:t>Health Event Reporting: "Summarize all Health events affecting production accounts this week," "Which scheduled maintenance events require action in the next 30 days," "Correlate this incident with recent Health events"</w:t>
       </w:r>
     </w:p>
@@ -1199,6 +941,7 @@
         <w:pStyle w:val="ListBullet"/>
       </w:pPr>
       <w:r>
+        <w:lastRenderedPageBreak/>
         <w:t>Knowledge Reuse: Saved findings become searchable context for future queries. When investigating a new issue, the AI can reference past documented solutions</w:t>
       </w:r>
       <w:r>
@@ -1261,15 +1004,7 @@
     </w:p>
     <w:p>
       <w:r>
-        <w:t xml:space="preserve">Multi-account queries are particularly valuable for </w:t>
-      </w:r>
-      <w:proofErr w:type="spellStart"/>
-      <w:r>
-        <w:t>CCoE</w:t>
-      </w:r>
-      <w:proofErr w:type="spellEnd"/>
-      <w:r>
-        <w:t xml:space="preserve"> leaders and FinOps teams managing enterprise AWS footprints.</w:t>
+        <w:t>Multi-account queries are particularly valuable for CCoE leaders and FinOps teams managing enterprise AWS footprints.</w:t>
       </w:r>
     </w:p>
     <w:p>
@@ -1306,13 +1041,8 @@
       <w:pPr>
         <w:pStyle w:val="ListBullet"/>
       </w:pPr>
-      <w:proofErr w:type="spellStart"/>
-      <w:r>
-        <w:t>AgentCore</w:t>
-      </w:r>
-      <w:proofErr w:type="spellEnd"/>
-      <w:r>
-        <w:t xml:space="preserve"> (orchestrating multi-step AI workflows across MCP servers)</w:t>
+      <w:r>
+        <w:t>AgentCore (orchestrating multi-step AI workflows across MCP servers)</w:t>
       </w:r>
     </w:p>
     <w:p>
@@ -1340,13 +1070,8 @@
       <w:pPr>
         <w:pStyle w:val="ListBullet"/>
       </w:pPr>
-      <w:proofErr w:type="spellStart"/>
-      <w:r>
-        <w:t>QuickSuite</w:t>
-      </w:r>
-      <w:proofErr w:type="spellEnd"/>
-      <w:r>
-        <w:t xml:space="preserve"> (UI customization)</w:t>
+      <w:r>
+        <w:t>QuickSuite (UI customization)</w:t>
       </w:r>
     </w:p>
     <w:p>
@@ -1369,13 +1094,8 @@
       <w:pPr>
         <w:pStyle w:val="ListBullet"/>
       </w:pPr>
-      <w:proofErr w:type="spellStart"/>
-      <w:r>
-        <w:t>EventBridge</w:t>
-      </w:r>
-      <w:proofErr w:type="spellEnd"/>
-      <w:r>
-        <w:t xml:space="preserve"> (event-driven automation)</w:t>
+      <w:r>
+        <w:t>EventBridge (event-driven automation)</w:t>
       </w:r>
     </w:p>
     <w:p>
@@ -1383,6 +1103,66 @@
         <w:t>Your TAM can help you estimate costs based on expected query volume.</w:t>
       </w:r>
     </w:p>
+    <w:p>
+      <w:r>
+        <w:t>What is the Network Troubleshooting Agent and how does it differ from AWS DevOps Agent?</w:t>
+      </w:r>
+    </w:p>
+    <w:p>
+      <w:r>
+        <w:t>The Network Troubleshooting Agent is G.O.A.T.'s standout capability. It provides on-demand VPC packet capture and deep TCP/TLS analysis through 21 specialized actions exposed via MCP. It addresses a critical gap in the operations toolchain:</w:t>
+      </w:r>
+    </w:p>
+    <w:p>
+      <w:r>
+        <w:t>AWS DevOps Agent excels at application-level incident investigation: it correlates alarms, analyzes code deployments via CI/CD pipelines (GitHub, GitLab, Azure DevOps), integrates with observability tools (CloudWatch, Datadog, Dynatrace), and provides autonomous root cause analysis with mitigation plans. It investigates incidents stemming from system changes, input anomalies, resource limits, and component failures within your application stack.</w:t>
+      </w:r>
+    </w:p>
+    <w:p>
+      <w:r>
+        <w:t xml:space="preserve">G.O.A.T.'s Network Agent operates at the infrastructure layer where DevOps Agent does not reach: it captures live VPC traffic via Traffic Mirroring, analyzes raw packets with AI, detects TLS Client Hello fragmentation issues (e.g., ML-KEM/post-quantum cryptography breaking Network Firewall Suricata rules), correlates TCP anomalies </w:t>
+      </w:r>
+      <w:r>
+        <w:lastRenderedPageBreak/>
+        <w:t>with Health events and Support cases, and performs deep packet inspection for MTU/MSS issues across Transit Gateway and Network Firewall paths.</w:t>
+      </w:r>
+    </w:p>
+    <w:p>
+      <w:r>
+        <w:t>Both tools are complementary and compatible via MCP: the same MCP servers that power G.O.A.T.'s Network Agent can be registered with AWS DevOps Agent simultaneously. Customers get application-level incident response from DevOps Agent AND infrastructure-level network forensics from G.O.A.T. in a unified experience.</w:t>
+      </w:r>
+    </w:p>
+    <w:p>
+      <w:r>
+        <w:t>What network troubleshooting scenarios does it handle?</w:t>
+      </w:r>
+    </w:p>
+    <w:p>
+      <w:r>
+        <w:t>The Network Agent supports the full lifecycle of packet-level network investigation:</w:t>
+      </w:r>
+    </w:p>
+    <w:p>
+      <w:r>
+        <w:t>TLS/MTU Fragmentation: Detects when post-quantum key exchange (ML-KEM) or large TLS extensions cause Client Hello packets to exceed the TCP MSS, resulting in fragmentation that Network Firewall Suricata cannot inspect. Surfaces the exact packet sizes, fragmentation offsets, and SNI extraction failures.</w:t>
+      </w:r>
+    </w:p>
+    <w:p>
+      <w:r>
+        <w:t>TCP Stream Diagnostics: Reconstructs TCP handshakes, detects retransmissions, out-of-order packets, zero-window events, and RST classifications. Provides RTT distribution analysis and request-response latency measurements.</w:t>
+      </w:r>
+    </w:p>
+    <w:p>
+      <w:r>
+        <w:t>VPC Connectivity Correlation: Correlates network capture data with AWS Health events, Trusted Advisor findings, and Support cases to provide end-to-end root cause analysis across Transit Gateway, VPC Peering, and PrivateLink paths.</w:t>
+      </w:r>
+    </w:p>
+    <w:p>
+      <w:r>
+        <w:t>On-Demand Capture Management: Start/stop captures on specific ENIs with automatic duration limits, transform pcap to queryable Parquet format via Athena, and run natural language queries against captured traffic.</w:t>
+      </w:r>
+    </w:p>
+    <w:p/>
     <w:p>
       <w:pPr>
         <w:pStyle w:val="ListParagraph"/>
@@ -1487,15 +1267,8 @@
         </w:numPr>
       </w:pPr>
       <w:r>
-        <w:t xml:space="preserve">GenAI Enablement: Customers learn GenAI by using it themselves, not by watching TAMs use it. Hands-on experience with familiar operational data accelerates GenAI adoption and builds confidence. This creates a foundation for customers to expand GenAI </w:t>
-      </w:r>
-      <w:proofErr w:type="gramStart"/>
-      <w:r>
-        <w:t>use</w:t>
-      </w:r>
-      <w:proofErr w:type="gramEnd"/>
-      <w:r>
-        <w:t xml:space="preserve"> to other domains.</w:t>
+        <w:lastRenderedPageBreak/>
+        <w:t>GenAI Enablement: Customers learn GenAI by using it themselves, not by watching TAMs use it. Hands-on experience with familiar operational data accelerates GenAI adoption and builds confidence. This creates a foundation for customers to expand GenAI use to other domains.</w:t>
       </w:r>
     </w:p>
     <w:p>
@@ -1778,6 +1551,7 @@
         <w:pStyle w:val="ListParagraph"/>
       </w:pPr>
       <w:r>
+        <w:lastRenderedPageBreak/>
         <w:t>If successful, how big could this be</w:t>
       </w:r>
       <w:r>
@@ -2047,23 +1821,7 @@
           <w:rFonts w:ascii="Calibri" w:eastAsia="MS Mincho" w:hAnsi="Calibri" w:cs="Times New Roman"/>
           <w:szCs w:val="22"/>
         </w:rPr>
-        <w:t xml:space="preserve">Target Audience for Demo: FinOps Teams, Cloud Operations Teams, </w:t>
-      </w:r>
-      <w:proofErr w:type="spellStart"/>
-      <w:r>
-        <w:rPr>
-          <w:rFonts w:ascii="Calibri" w:eastAsia="MS Mincho" w:hAnsi="Calibri" w:cs="Times New Roman"/>
-          <w:szCs w:val="22"/>
-        </w:rPr>
-        <w:t>CCoE</w:t>
-      </w:r>
-      <w:proofErr w:type="spellEnd"/>
-      <w:r>
-        <w:rPr>
-          <w:rFonts w:ascii="Calibri" w:eastAsia="MS Mincho" w:hAnsi="Calibri" w:cs="Times New Roman"/>
-          <w:szCs w:val="22"/>
-        </w:rPr>
-        <w:t xml:space="preserve"> Leaders, DevOps Engineers, SREs</w:t>
+        <w:t>Target Audience for Demo: FinOps Teams, Cloud Operations Teams, CCoE Leaders, DevOps Engineers, SREs</w:t>
       </w:r>
     </w:p>
     <w:p>
@@ -2105,23 +1863,7 @@
           <w:rFonts w:ascii="Calibri" w:eastAsia="MS Mincho" w:hAnsi="Calibri" w:cs="Times New Roman"/>
           <w:szCs w:val="22"/>
         </w:rPr>
-        <w:t xml:space="preserve">Key Technologies: Amazon Bedrock, Amazon Nova, </w:t>
-      </w:r>
-      <w:proofErr w:type="spellStart"/>
-      <w:r>
-        <w:rPr>
-          <w:rFonts w:ascii="Calibri" w:eastAsia="MS Mincho" w:hAnsi="Calibri" w:cs="Times New Roman"/>
-          <w:szCs w:val="22"/>
-        </w:rPr>
-        <w:t>AgentCore</w:t>
-      </w:r>
-      <w:proofErr w:type="spellEnd"/>
-      <w:r>
-        <w:rPr>
-          <w:rFonts w:ascii="Calibri" w:eastAsia="MS Mincho" w:hAnsi="Calibri" w:cs="Times New Roman"/>
-          <w:szCs w:val="22"/>
-        </w:rPr>
-        <w:t>, MCP Servers (6 integrations)</w:t>
+        <w:t>Key Technologies: Amazon Bedrock, Amazon Nova, AgentCore, MCP Servers (6 integrations)</w:t>
       </w:r>
     </w:p>
     <w:p>
@@ -2195,25 +1937,8 @@
           <w:szCs w:val="22"/>
           <w:lang w:val="fr-FR"/>
         </w:rPr>
-        <w:t xml:space="preserve">Code </w:t>
-      </w:r>
-      <w:proofErr w:type="gramStart"/>
-      <w:r>
-        <w:rPr>
-          <w:rFonts w:ascii="Calibri" w:eastAsia="MS Mincho" w:hAnsi="Calibri" w:cs="Times New Roman"/>
-          <w:szCs w:val="22"/>
-          <w:lang w:val="fr-FR"/>
-        </w:rPr>
-        <w:t>Repository:</w:t>
-      </w:r>
-      <w:proofErr w:type="gramEnd"/>
-      <w:r>
-        <w:rPr>
-          <w:rFonts w:ascii="Calibri" w:eastAsia="MS Mincho" w:hAnsi="Calibri" w:cs="Times New Roman"/>
-          <w:szCs w:val="22"/>
-          <w:lang w:val="fr-FR"/>
-        </w:rPr>
-        <w:t xml:space="preserve"> https://github.com/aws-samples/</w:t>
+        <w:lastRenderedPageBreak/>
+        <w:t>Code Repository: https://github.com/aws-samples/</w:t>
       </w:r>
       <w:r>
         <w:rPr>
@@ -2844,6 +2569,48 @@
           </w:p>
         </w:tc>
       </w:tr>
+      <w:tr>
+        <w:trPr>
+          <w:cnfStyle w:val="000000010000" w:firstRow="0" w:lastRow="0" w:firstColumn="0" w:lastColumn="0" w:oddVBand="0" w:evenVBand="0" w:oddHBand="0" w:evenHBand="1" w:firstRowFirstColumn="0" w:firstRowLastColumn="0" w:lastRowFirstColumn="0" w:lastRowLastColumn="0"/>
+        </w:trPr>
+        <w:tc>
+          <w:tcPr>
+            <w:cnfStyle w:val="001000000000" w:firstRow="0" w:lastRow="0" w:firstColumn="1" w:lastColumn="0" w:oddVBand="0" w:evenVBand="0" w:oddHBand="0" w:evenHBand="0" w:firstRowFirstColumn="0" w:firstRowLastColumn="0" w:lastRowFirstColumn="0" w:lastRowLastColumn="0"/>
+            <w:tcW w:w="2880" w:type="dxa"/>
+          </w:tcPr>
+          <w:p>
+            <w:r>
+              <w:t>Network Troubleshooting MCP Server</w:t>
+            </w:r>
+          </w:p>
+        </w:tc>
+        <w:tc>
+          <w:tcPr>
+            <w:tcW w:w="2880" w:type="dxa"/>
+          </w:tcPr>
+          <w:p>
+            <w:pPr>
+              <w:cnfStyle w:val="000000010000" w:firstRow="0" w:lastRow="0" w:firstColumn="0" w:lastColumn="0" w:oddVBand="0" w:evenVBand="0" w:oddHBand="0" w:evenHBand="1" w:firstRowFirstColumn="0" w:firstRowLastColumn="0" w:lastRowFirstColumn="0" w:lastRowLastColumn="0"/>
+            </w:pPr>
+            <w:r>
+              <w:t>New</w:t>
+            </w:r>
+          </w:p>
+        </w:tc>
+        <w:tc>
+          <w:tcPr>
+            <w:tcW w:w="2880" w:type="dxa"/>
+          </w:tcPr>
+          <w:p>
+            <w:pPr>
+              <w:cnfStyle w:val="000000010000" w:firstRow="0" w:lastRow="0" w:firstColumn="0" w:lastColumn="0" w:oddVBand="0" w:evenVBand="0" w:oddHBand="0" w:evenHBand="1" w:firstRowFirstColumn="0" w:firstRowLastColumn="0" w:lastRowFirstColumn="0" w:lastRowLastColumn="0"/>
+            </w:pPr>
+            <w:r>
+              <w:t>VPC Traffic Mirroring, packet analysis, network path correlation</w:t>
+            </w:r>
+          </w:p>
+        </w:tc>
+      </w:tr>
     </w:tbl>
     <w:p>
       <w:pPr>
@@ -3250,6 +3017,7 @@
         <w:pStyle w:val="Heading2"/>
       </w:pPr>
       <w:r>
+        <w:lastRenderedPageBreak/>
         <w:t xml:space="preserve">Appendix B: </w:t>
       </w:r>
       <w:r>
@@ -3298,15 +3066,7 @@
         </w:numPr>
       </w:pPr>
       <w:r>
-        <w:t xml:space="preserve">Demo Training via Growth Days: Live demo showcases during monthly Growth Days; Focus </w:t>
-      </w:r>
-      <w:proofErr w:type="gramStart"/>
-      <w:r>
-        <w:t>on:</w:t>
-      </w:r>
-      <w:proofErr w:type="gramEnd"/>
-      <w:r>
-        <w:t xml:space="preserve"> demonstration flow, customer value messaging, deployment support guidance; Practice handling questions about customer deployment and GenAI learning benefits</w:t>
+        <w:t>Demo Training via Growth Days: Live demo showcases during monthly Growth Days; Focus on: demonstration flow, customer value messaging, deployment support guidance; Practice handling questions about customer deployment and GenAI learning benefits</w:t>
       </w:r>
     </w:p>
     <w:p>
@@ -3570,15 +3330,8 @@
         <w:ind w:left="360" w:hanging="360"/>
       </w:pPr>
       <w:r>
-        <w:t xml:space="preserve">Deploy </w:t>
-      </w:r>
-      <w:proofErr w:type="spellStart"/>
-      <w:r>
-        <w:t>AgentCore</w:t>
-      </w:r>
-      <w:proofErr w:type="spellEnd"/>
-      <w:r>
-        <w:t xml:space="preserve"> orchestration layer</w:t>
+        <w:lastRenderedPageBreak/>
+        <w:t>Deploy AgentCore orchestration layer</w:t>
       </w:r>
     </w:p>
     <w:p>
@@ -3698,15 +3451,7 @@
         <w:t>Tool</w:t>
       </w:r>
       <w:r>
-        <w:t xml:space="preserve"> is built on a modular, multi-agent architecture powered by Amazon Bedrock </w:t>
-      </w:r>
-      <w:proofErr w:type="spellStart"/>
-      <w:r>
-        <w:t>AgentCore</w:t>
-      </w:r>
-      <w:proofErr w:type="spellEnd"/>
-      <w:r>
-        <w:t>. This design enables flexible deployment options—customers can deploy individual modules for specific use cases or the complete solution for unified operational intelligence. The solution includes a ready-to-deploy chatbot frontend that provides an intuitive conversational interface for operational teams.</w:t>
+        <w:t xml:space="preserve"> is built on a modular, multi-agent architecture powered by Amazon Bedrock AgentCore. This design enables flexible deployment options—customers can deploy individual modules for specific use cases or the complete solution for unified operational intelligence. The solution includes a ready-to-deploy chatbot frontend that provides an intuitive conversational interface for operational teams.</w:t>
       </w:r>
     </w:p>
     <w:p>
@@ -3720,15 +3465,7 @@
         <w:t>, as knowledge base for guidance and best practices in Confluence</w:t>
       </w:r>
       <w:r>
-        <w:t xml:space="preserve">, ServiceNow…, and as an input to build </w:t>
-      </w:r>
-      <w:proofErr w:type="spellStart"/>
-      <w:r>
-        <w:t>QuickSuite</w:t>
-      </w:r>
-      <w:proofErr w:type="spellEnd"/>
-      <w:r>
-        <w:t xml:space="preserve"> dashboards</w:t>
+        <w:t>, ServiceNow…, and as an input to build QuickSuite dashboards</w:t>
       </w:r>
       <w:r>
         <w:t xml:space="preserve"> and graphs.</w:t>
@@ -3736,15 +3473,7 @@
     </w:p>
     <w:p>
       <w:r>
-        <w:t xml:space="preserve">Existing EOL Tracker solution will be integrated </w:t>
-      </w:r>
-      <w:proofErr w:type="gramStart"/>
-      <w:r>
-        <w:t>to</w:t>
-      </w:r>
-      <w:proofErr w:type="gramEnd"/>
-      <w:r>
-        <w:t xml:space="preserve"> the new solution (as an option)</w:t>
+        <w:t>Existing EOL Tracker solution will be integrated to the new solution (as an option)</w:t>
       </w:r>
     </w:p>
     <w:p>
@@ -3862,13 +3591,8 @@
             <w:tcW w:w="4320" w:type="dxa"/>
           </w:tcPr>
           <w:p>
-            <w:proofErr w:type="spellStart"/>
-            <w:r>
-              <w:t>AgentCore</w:t>
-            </w:r>
-            <w:proofErr w:type="spellEnd"/>
-            <w:r>
-              <w:t xml:space="preserve"> Foundation</w:t>
+            <w:r>
+              <w:t>AgentCore Foundation</w:t>
             </w:r>
           </w:p>
         </w:tc>
@@ -3881,15 +3605,7 @@
               <w:cnfStyle w:val="000000100000" w:firstRow="0" w:lastRow="0" w:firstColumn="0" w:lastColumn="0" w:oddVBand="0" w:evenVBand="0" w:oddHBand="1" w:evenHBand="0" w:firstRowFirstColumn="0" w:firstRowLastColumn="0" w:lastRowFirstColumn="0" w:lastRowLastColumn="0"/>
             </w:pPr>
             <w:r>
-              <w:t xml:space="preserve">Built entirely on Amazon Bedrock </w:t>
-            </w:r>
-            <w:proofErr w:type="spellStart"/>
-            <w:r>
-              <w:t>AgentCore</w:t>
-            </w:r>
-            <w:proofErr w:type="spellEnd"/>
-            <w:r>
-              <w:t xml:space="preserve"> for enterprise-grade agent management and scaling</w:t>
+              <w:t>Built entirely on Amazon Bedrock AgentCore for enterprise-grade agent management and scaling</w:t>
             </w:r>
           </w:p>
         </w:tc>
@@ -3968,15 +3684,7 @@
     </w:p>
     <w:p>
       <w:r>
-        <w:t>Orchestration Agent (</w:t>
-      </w:r>
-      <w:proofErr w:type="spellStart"/>
-      <w:r>
-        <w:t>AgentCore</w:t>
-      </w:r>
-      <w:proofErr w:type="spellEnd"/>
-      <w:r>
-        <w:t>):</w:t>
+        <w:t>Orchestration Agent (AgentCore):</w:t>
       </w:r>
     </w:p>
     <w:p>
@@ -4008,6 +3716,7 @@
         <w:pStyle w:val="ListBullet"/>
       </w:pPr>
       <w:r>
+        <w:lastRenderedPageBreak/>
         <w:t>Response aggregation and formatting</w:t>
       </w:r>
     </w:p>
@@ -4021,22 +3730,25 @@
     </w:p>
     <w:p>
       <w:pPr>
-        <w:pStyle w:val="ListBullet"/>
-        <w:numPr>
-          <w:ilvl w:val="0"/>
-          <w:numId w:val="0"/>
-        </w:numPr>
-        <w:ind w:left="360" w:hanging="360"/>
+        <w:pStyle w:val="Heading2"/>
+      </w:pPr>
+      <w:r>
+        <w:t>Architecture Overview</w:t>
+      </w:r>
+    </w:p>
+    <w:p>
+      <w:pPr>
+        <w:jc w:val="center"/>
       </w:pPr>
       <w:r>
         <w:rPr>
           <w:noProof/>
         </w:rPr>
         <w:drawing>
-          <wp:inline distT="0" distB="0" distL="0" distR="0" wp14:anchorId="2EAF613A" wp14:editId="70230438">
-            <wp:extent cx="6400800" cy="5144770"/>
+          <wp:inline distT="0" distB="0" distL="0" distR="0" wp14:anchorId="3404C3AD" wp14:editId="35D39AEA">
+            <wp:extent cx="5943600" cy="4033157"/>
             <wp:effectExtent l="0" t="0" r="0" b="0"/>
-            <wp:docPr id="257211235" name="Picture 1"/>
+            <wp:docPr id="257211236" name="Picture 257211236"/>
             <wp:cNvGraphicFramePr>
               <a:graphicFrameLocks xmlns:a="http://schemas.openxmlformats.org/drawingml/2006/main" noChangeAspect="1"/>
             </wp:cNvGraphicFramePr>
@@ -4044,7 +3756,7 @@
               <a:graphicData uri="http://schemas.openxmlformats.org/drawingml/2006/picture">
                 <pic:pic xmlns:pic="http://schemas.openxmlformats.org/drawingml/2006/picture">
                   <pic:nvPicPr>
-                    <pic:cNvPr id="257211235" name=""/>
+                    <pic:cNvPr id="0" name="goat_architecture_diagram.png"/>
                     <pic:cNvPicPr/>
                   </pic:nvPicPr>
                   <pic:blipFill>
@@ -4056,7 +3768,7 @@
                   <pic:spPr>
                     <a:xfrm>
                       <a:off x="0" y="0"/>
-                      <a:ext cx="6400800" cy="5144770"/>
+                      <a:ext cx="5943600" cy="4033157"/>
                     </a:xfrm>
                     <a:prstGeom prst="rect">
                       <a:avLst/>
@@ -4068,6 +3780,21 @@
           </wp:inline>
         </w:drawing>
       </w:r>
+    </w:p>
+    <w:p>
+      <w:r>
+        <w:t>Figure 1: G.O.A.T. Multi-Agent Architecture with Network Capture Pipeline and DevOps Agent MCP Compatibility</w:t>
+      </w:r>
+    </w:p>
+    <w:p>
+      <w:pPr>
+        <w:pStyle w:val="ListBullet"/>
+        <w:numPr>
+          <w:ilvl w:val="0"/>
+          <w:numId w:val="0"/>
+        </w:numPr>
+        <w:ind w:left="360" w:hanging="360"/>
+      </w:pPr>
     </w:p>
     <w:p>
       <w:pPr>
@@ -4193,27 +3920,9 @@
             <w:pPr>
               <w:cnfStyle w:val="000000100000" w:firstRow="0" w:lastRow="0" w:firstColumn="0" w:lastColumn="0" w:oddVBand="0" w:evenVBand="0" w:oddHBand="1" w:evenHBand="0" w:firstRowFirstColumn="0" w:firstRowLastColumn="0" w:lastRowFirstColumn="0" w:lastRowLastColumn="0"/>
             </w:pPr>
-            <w:proofErr w:type="spellStart"/>
-            <w:r>
-              <w:t>get_cost_and_usage</w:t>
-            </w:r>
-            <w:proofErr w:type="spellEnd"/>
-            <w:r>
-              <w:t xml:space="preserve">, </w:t>
-            </w:r>
-            <w:proofErr w:type="spellStart"/>
-            <w:r>
-              <w:t>get_cost_forecast</w:t>
-            </w:r>
-            <w:proofErr w:type="spellEnd"/>
-            <w:r>
-              <w:t xml:space="preserve">, </w:t>
-            </w:r>
-            <w:proofErr w:type="spellStart"/>
-            <w:r>
-              <w:t>list_recommendations</w:t>
-            </w:r>
-            <w:proofErr w:type="spellEnd"/>
+            <w:r>
+              <w:t>get_cost_and_usage, get_cost_forecast, list_recommendations</w:t>
+            </w:r>
           </w:p>
         </w:tc>
       </w:tr>
@@ -4266,27 +3975,9 @@
             <w:pPr>
               <w:cnfStyle w:val="000000010000" w:firstRow="0" w:lastRow="0" w:firstColumn="0" w:lastColumn="0" w:oddVBand="0" w:evenVBand="0" w:oddHBand="0" w:evenHBand="1" w:firstRowFirstColumn="0" w:firstRowLastColumn="0" w:lastRowFirstColumn="0" w:lastRowLastColumn="0"/>
             </w:pPr>
-            <w:proofErr w:type="spellStart"/>
-            <w:r>
-              <w:t>describe_events</w:t>
-            </w:r>
-            <w:proofErr w:type="spellEnd"/>
-            <w:r>
-              <w:t xml:space="preserve">, </w:t>
-            </w:r>
-            <w:proofErr w:type="spellStart"/>
-            <w:r>
-              <w:t>describe_affected_entities</w:t>
-            </w:r>
-            <w:proofErr w:type="spellEnd"/>
-            <w:r>
-              <w:t xml:space="preserve">, </w:t>
-            </w:r>
-            <w:proofErr w:type="spellStart"/>
-            <w:r>
-              <w:t>describe_event_details</w:t>
-            </w:r>
-            <w:proofErr w:type="spellEnd"/>
+            <w:r>
+              <w:t>describe_events, describe_affected_entities, describe_event_details</w:t>
+            </w:r>
           </w:p>
         </w:tc>
       </w:tr>
@@ -4339,27 +4030,9 @@
             <w:pPr>
               <w:cnfStyle w:val="000000100000" w:firstRow="0" w:lastRow="0" w:firstColumn="0" w:lastColumn="0" w:oddVBand="0" w:evenVBand="0" w:oddHBand="1" w:evenHBand="0" w:firstRowFirstColumn="0" w:firstRowLastColumn="0" w:lastRowFirstColumn="0" w:lastRowLastColumn="0"/>
             </w:pPr>
-            <w:proofErr w:type="spellStart"/>
-            <w:r>
-              <w:t>describe_cases</w:t>
-            </w:r>
-            <w:proofErr w:type="spellEnd"/>
-            <w:r>
-              <w:t xml:space="preserve">, </w:t>
-            </w:r>
-            <w:proofErr w:type="spellStart"/>
-            <w:r>
-              <w:t>describe_communications</w:t>
-            </w:r>
-            <w:proofErr w:type="spellEnd"/>
-            <w:r>
-              <w:t xml:space="preserve">, </w:t>
-            </w:r>
-            <w:proofErr w:type="spellStart"/>
-            <w:r>
-              <w:t>search_similar_cases</w:t>
-            </w:r>
-            <w:proofErr w:type="spellEnd"/>
+            <w:r>
+              <w:t>describe_cases, describe_communications, search_similar_cases</w:t>
+            </w:r>
           </w:p>
         </w:tc>
       </w:tr>
@@ -4374,6 +4047,7 @@
           </w:tcPr>
           <w:p>
             <w:r>
+              <w:lastRenderedPageBreak/>
               <w:t>Trusted Advisor Agent</w:t>
             </w:r>
           </w:p>
@@ -4412,27 +4086,9 @@
             <w:pPr>
               <w:cnfStyle w:val="000000010000" w:firstRow="0" w:lastRow="0" w:firstColumn="0" w:lastColumn="0" w:oddVBand="0" w:evenVBand="0" w:oddHBand="0" w:evenHBand="1" w:firstRowFirstColumn="0" w:firstRowLastColumn="0" w:lastRowFirstColumn="0" w:lastRowLastColumn="0"/>
             </w:pPr>
-            <w:proofErr w:type="spellStart"/>
-            <w:r>
-              <w:t>describe_checks</w:t>
-            </w:r>
-            <w:proofErr w:type="spellEnd"/>
-            <w:r>
-              <w:t xml:space="preserve">, </w:t>
-            </w:r>
-            <w:proofErr w:type="spellStart"/>
-            <w:r>
-              <w:t>describe_check_result</w:t>
-            </w:r>
-            <w:proofErr w:type="spellEnd"/>
-            <w:r>
-              <w:t xml:space="preserve">, </w:t>
-            </w:r>
-            <w:proofErr w:type="spellStart"/>
-            <w:r>
-              <w:t>list_recommendations</w:t>
-            </w:r>
-            <w:proofErr w:type="spellEnd"/>
+            <w:r>
+              <w:t>describe_checks, describe_check_result, list_recommendations</w:t>
+            </w:r>
           </w:p>
         </w:tc>
       </w:tr>
@@ -4485,27 +4141,64 @@
             <w:pPr>
               <w:cnfStyle w:val="000000100000" w:firstRow="0" w:lastRow="0" w:firstColumn="0" w:lastColumn="0" w:oddVBand="0" w:evenVBand="0" w:oddHBand="1" w:evenHBand="0" w:firstRowFirstColumn="0" w:firstRowLastColumn="0" w:lastRowFirstColumn="0" w:lastRowLastColumn="0"/>
             </w:pPr>
-            <w:proofErr w:type="spellStart"/>
-            <w:r>
-              <w:t>query_cur_data</w:t>
-            </w:r>
-            <w:proofErr w:type="spellEnd"/>
-            <w:r>
-              <w:t xml:space="preserve">, </w:t>
-            </w:r>
-            <w:proofErr w:type="spellStart"/>
-            <w:r>
-              <w:t>get_resource_costs</w:t>
-            </w:r>
-            <w:proofErr w:type="spellEnd"/>
-            <w:r>
-              <w:t xml:space="preserve">, </w:t>
-            </w:r>
-            <w:proofErr w:type="spellStart"/>
-            <w:r>
-              <w:t>analyze_usage_patterns</w:t>
-            </w:r>
-            <w:proofErr w:type="spellEnd"/>
+            <w:r>
+              <w:t>query_cur_data, get_resource_costs, analyze_usage_patterns</w:t>
+            </w:r>
+          </w:p>
+        </w:tc>
+      </w:tr>
+      <w:tr>
+        <w:trPr>
+          <w:cnfStyle w:val="000000010000" w:firstRow="0" w:lastRow="0" w:firstColumn="0" w:lastColumn="0" w:oddVBand="0" w:evenVBand="0" w:oddHBand="0" w:evenHBand="1" w:firstRowFirstColumn="0" w:firstRowLastColumn="0" w:lastRowFirstColumn="0" w:lastRowLastColumn="0"/>
+        </w:trPr>
+        <w:tc>
+          <w:tcPr>
+            <w:cnfStyle w:val="001000000000" w:firstRow="0" w:lastRow="0" w:firstColumn="1" w:lastColumn="0" w:oddVBand="0" w:evenVBand="0" w:oddHBand="0" w:evenHBand="0" w:firstRowFirstColumn="0" w:firstRowLastColumn="0" w:lastRowFirstColumn="0" w:lastRowLastColumn="0"/>
+            <w:tcW w:w="2160" w:type="dxa"/>
+          </w:tcPr>
+          <w:p>
+            <w:r>
+              <w:t>Network Agent</w:t>
+            </w:r>
+          </w:p>
+        </w:tc>
+        <w:tc>
+          <w:tcPr>
+            <w:tcW w:w="2160" w:type="dxa"/>
+          </w:tcPr>
+          <w:p>
+            <w:pPr>
+              <w:cnfStyle w:val="000000010000" w:firstRow="0" w:lastRow="0" w:firstColumn="0" w:lastColumn="0" w:oddVBand="0" w:evenVBand="0" w:oddHBand="0" w:evenHBand="1" w:firstRowFirstColumn="0" w:firstRowLastColumn="0" w:lastRowFirstColumn="0" w:lastRowLastColumn="0"/>
+            </w:pPr>
+            <w:r>
+              <w:t>Amazon Nova</w:t>
+            </w:r>
+          </w:p>
+        </w:tc>
+        <w:tc>
+          <w:tcPr>
+            <w:tcW w:w="2160" w:type="dxa"/>
+          </w:tcPr>
+          <w:p>
+            <w:pPr>
+              <w:cnfStyle w:val="000000010000" w:firstRow="0" w:lastRow="0" w:firstColumn="0" w:lastColumn="0" w:oddVBand="0" w:evenVBand="0" w:oddHBand="0" w:evenHBand="1" w:firstRowFirstColumn="0" w:firstRowLastColumn="0" w:lastRowFirstColumn="0" w:lastRowLastColumn="0"/>
+            </w:pPr>
+            <w:r>
+              <w:t>Network MCP (NEW)</w:t>
+            </w:r>
+          </w:p>
+        </w:tc>
+        <w:tc>
+          <w:tcPr>
+            <w:tcW w:w="2657" w:type="dxa"/>
+          </w:tcPr>
+          <w:p>
+            <w:pPr>
+              <w:cnfStyle w:val="000000010000" w:firstRow="0" w:lastRow="0" w:firstColumn="0" w:lastColumn="0" w:oddVBand="0" w:evenVBand="0" w:oddHBand="0" w:evenHBand="1" w:firstRowFirstColumn="0" w:firstRowLastColumn="0" w:lastRowFirstColumn="0" w:lastRowLastColumn="0"/>
+            </w:pPr>
+            <w:r>
+              <w:t>capture_vpc_traffic, analyze_packets, correlate_network_events, trace_path</w:t>
+            </w:r>
           </w:p>
         </w:tc>
       </w:tr>
@@ -5001,6 +4694,7 @@
           </w:tcPr>
           <w:p>
             <w:r>
+              <w:lastRenderedPageBreak/>
               <w:t>API Communication</w:t>
             </w:r>
           </w:p>
@@ -5372,6 +5066,35 @@
           </w:p>
         </w:tc>
       </w:tr>
+      <w:tr>
+        <w:trPr>
+          <w:cnfStyle w:val="000000010000" w:firstRow="0" w:lastRow="0" w:firstColumn="0" w:lastColumn="0" w:oddVBand="0" w:evenVBand="0" w:oddHBand="0" w:evenHBand="1" w:firstRowFirstColumn="0" w:firstRowLastColumn="0" w:lastRowFirstColumn="0" w:lastRowLastColumn="0"/>
+        </w:trPr>
+        <w:tc>
+          <w:tcPr>
+            <w:cnfStyle w:val="001000000000" w:firstRow="0" w:lastRow="0" w:firstColumn="1" w:lastColumn="0" w:oddVBand="0" w:evenVBand="0" w:oddHBand="0" w:evenHBand="0" w:firstRowFirstColumn="0" w:firstRowLastColumn="0" w:lastRowFirstColumn="0" w:lastRowLastColumn="0"/>
+            <w:tcW w:w="4320" w:type="dxa"/>
+          </w:tcPr>
+          <w:p>
+            <w:r>
+              <w:t>Network Agent</w:t>
+            </w:r>
+          </w:p>
+        </w:tc>
+        <w:tc>
+          <w:tcPr>
+            <w:tcW w:w="4320" w:type="dxa"/>
+          </w:tcPr>
+          <w:p>
+            <w:pPr>
+              <w:cnfStyle w:val="000000010000" w:firstRow="0" w:lastRow="0" w:firstColumn="0" w:lastColumn="0" w:oddVBand="0" w:evenVBand="0" w:oddHBand="0" w:evenHBand="1" w:firstRowFirstColumn="0" w:firstRowLastColumn="0" w:lastRowFirstColumn="0" w:lastRowLastColumn="0"/>
+            </w:pPr>
+            <w:r>
+              <w:t>Network/infrastructure teams troubleshooting connectivity and packet-level issues</w:t>
+            </w:r>
+          </w:p>
+        </w:tc>
+      </w:tr>
     </w:tbl>
     <w:p>
       <w:r>
@@ -5382,11 +5105,9 @@
       <w:r>
         <w:t xml:space="preserve">Option 3: Progressive Deployment - Start with the chatbot and one module, add more </w:t>
       </w:r>
-      <w:proofErr w:type="gramStart"/>
       <w:r>
         <w:t>over time</w:t>
       </w:r>
-      <w:proofErr w:type="gramEnd"/>
       <w:r>
         <w:t>:</w:t>
       </w:r>
@@ -5671,6 +5392,7 @@
           </w:tcPr>
           <w:p>
             <w:r>
+              <w:lastRenderedPageBreak/>
               <w:t>Trusted Advisor MCP Server</w:t>
             </w:r>
           </w:p>
@@ -5740,6 +5462,48 @@
             </w:pPr>
             <w:r>
               <w:t>Account/org events, scheduled changes</w:t>
+            </w:r>
+          </w:p>
+        </w:tc>
+      </w:tr>
+      <w:tr>
+        <w:trPr>
+          <w:cnfStyle w:val="000000100000" w:firstRow="0" w:lastRow="0" w:firstColumn="0" w:lastColumn="0" w:oddVBand="0" w:evenVBand="0" w:oddHBand="1" w:evenHBand="0" w:firstRowFirstColumn="0" w:firstRowLastColumn="0" w:lastRowFirstColumn="0" w:lastRowLastColumn="0"/>
+        </w:trPr>
+        <w:tc>
+          <w:tcPr>
+            <w:cnfStyle w:val="001000000000" w:firstRow="0" w:lastRow="0" w:firstColumn="1" w:lastColumn="0" w:oddVBand="0" w:evenVBand="0" w:oddHBand="0" w:evenHBand="0" w:firstRowFirstColumn="0" w:firstRowLastColumn="0" w:lastRowFirstColumn="0" w:lastRowLastColumn="0"/>
+            <w:tcW w:w="2880" w:type="dxa"/>
+          </w:tcPr>
+          <w:p>
+            <w:r>
+              <w:t>Network Troubleshooting MCP Server</w:t>
+            </w:r>
+          </w:p>
+        </w:tc>
+        <w:tc>
+          <w:tcPr>
+            <w:tcW w:w="2880" w:type="dxa"/>
+          </w:tcPr>
+          <w:p>
+            <w:pPr>
+              <w:cnfStyle w:val="000000100000" w:firstRow="0" w:lastRow="0" w:firstColumn="0" w:lastColumn="0" w:oddVBand="0" w:evenVBand="0" w:oddHBand="1" w:evenHBand="0" w:firstRowFirstColumn="0" w:firstRowLastColumn="0" w:lastRowFirstColumn="0" w:lastRowLastColumn="0"/>
+            </w:pPr>
+            <w:r>
+              <w:t>New</w:t>
+            </w:r>
+          </w:p>
+        </w:tc>
+        <w:tc>
+          <w:tcPr>
+            <w:tcW w:w="2880" w:type="dxa"/>
+          </w:tcPr>
+          <w:p>
+            <w:pPr>
+              <w:cnfStyle w:val="000000100000" w:firstRow="0" w:lastRow="0" w:firstColumn="0" w:lastColumn="0" w:oddVBand="0" w:evenVBand="0" w:oddHBand="1" w:evenHBand="0" w:firstRowFirstColumn="0" w:firstRowLastColumn="0" w:lastRowFirstColumn="0" w:lastRowLastColumn="0"/>
+            </w:pPr>
+            <w:r>
+              <w:t>VPC Traffic Mirroring, packet analysis, network path correlation</w:t>
             </w:r>
           </w:p>
         </w:tc>
@@ -5845,15 +5609,7 @@
               <w:cnfStyle w:val="000000010000" w:firstRow="0" w:lastRow="0" w:firstColumn="0" w:lastColumn="0" w:oddVBand="0" w:evenVBand="0" w:oddHBand="0" w:evenHBand="1" w:firstRowFirstColumn="0" w:firstRowLastColumn="0" w:lastRowFirstColumn="0" w:lastRowLastColumn="0"/>
             </w:pPr>
             <w:r>
-              <w:t xml:space="preserve">Deploy what you </w:t>
-            </w:r>
-            <w:proofErr w:type="gramStart"/>
-            <w:r>
-              <w:t>need,</w:t>
-            </w:r>
-            <w:proofErr w:type="gramEnd"/>
-            <w:r>
-              <w:t xml:space="preserve"> when you need it</w:t>
+              <w:t>Deploy what you need, when you need it</w:t>
             </w:r>
           </w:p>
         </w:tc>
@@ -5997,13 +5753,8 @@
             <w:pPr>
               <w:cnfStyle w:val="000000100000" w:firstRow="0" w:lastRow="0" w:firstColumn="0" w:lastColumn="0" w:oddVBand="0" w:evenVBand="0" w:oddHBand="1" w:evenHBand="0" w:firstRowFirstColumn="0" w:firstRowLastColumn="0" w:lastRowFirstColumn="0" w:lastRowLastColumn="0"/>
             </w:pPr>
-            <w:proofErr w:type="spellStart"/>
-            <w:r>
-              <w:t>AgentCore</w:t>
-            </w:r>
-            <w:proofErr w:type="spellEnd"/>
-            <w:r>
-              <w:t xml:space="preserve"> provides production-grade agent management</w:t>
+            <w:r>
+              <w:t>AgentCore provides production-grade agent management</w:t>
             </w:r>
           </w:p>
         </w:tc>

</xml_diff>